<commit_message>
Sandy & Junior 2027: revisão da Parte 1
Co-Authored-By: Claude Opus 5.5 <noreply@anthropic.com>
Claude-Session: https://claude.ai/code/session_01MJjUEEZrxQDEUifKK2vj9g
</commit_message>
<xml_diff>
--- a/roteiros/sandy-junior-2027/SJ27_Parte1.docx
+++ b/roteiros/sandy-junior-2027/SJ27_Parte1.docx
@@ -87,7 +87,7 @@
         <w:rPr>
           <w:color w:val="000000"/>
         </w:rPr>
-        <w:t>A dupla continuava enchendo ginásios. Os discos continuavam vendendo. Não havia briga pública nem queda de audiência.</w:t>
+        <w:t>Os irmãos continuavam entre os artistas mais conhecidos do Brasil. Não havia briga pública entre os dois.</w:t>
       </w:r>
     </w:p>
     <w:p>
@@ -119,7 +119,7 @@
         <w:rPr>
           <w:color w:val="000000"/>
         </w:rPr>
-        <w:t>Para entender o que aconteceu naquela sala, é preciso voltar muito antes do anúncio.</w:t>
+        <w:t>Para entender o que aconteceu naquela conversa, é preciso voltar muito antes do anúncio.</w:t>
       </w:r>
     </w:p>
     <w:p>
@@ -231,7 +231,7 @@
         <w:rPr>
           <w:color w:val="C00000"/>
         </w:rPr>
-        <w:t>Guarde essa imagem com carinho. Duas crianças cantando na sala de casa, sem plateia e sem contrato. Porque bastou um único convite, feito quase por acaso, para que essa brincadeira virasse uma máquina. E nenhum dos dois teve a chance de dizer se queria entrar nela.</w:t>
+        <w:t>Guarde essa imagem com carinho. Duas crianças cantando na sala de casa, sem plateia e sem contrato. Porque bastou um único convite, feito quase por acaso, para que essa brincadeira virasse uma máquina. E ninguém ali imaginava o preço que aquelas duas crianças iam pagar por entrar nela.</w:t>
       </w:r>
     </w:p>
     <w:p>

</xml_diff>